<commit_message>
fix: correct OOXML translator/post-processing so Word actually accepts the .docx
The generated .docx passed every existing structural test while being
unusable in Word: no wpg/wps/wpc namespace on the document root (the
post-processing that was supposed to add it was a silent no-op), duplicate
drawing ids across wp:docPr/wpg:cNvPr/wps:cNvPr (Word reports the file as
corrupt), a module-level id counter that made the translator non-deterministic,
wp:anchor instead of the spec-mandated wp:inline, no arrow heads/dash
patterns/stroke widths on connectors despite the line-style table being
computed, edge labels silently dropped, and shape text colored white
(theme fontRef) on the light default fill.

Also removes packages/cli/bin/docx-patch.mjs: a second, dead (imported
nowhere), broken (require() in an ESM module) implementation of the same
post-processing step.

Co-Authored-By: Claude Sonnet 5 <noreply@anthropic.com>
</commit_message>
<xml_diff>
--- a/test-corpus/output/corpus/large2.docx
+++ b/test-corpus/output/corpus/large2.docx
@@ -1,6 +1,6 @@
 
 <file path=word/document.xml><?xml version="1.0" encoding="utf-8"?>
-<w:document xmlns:w="http://schemas.openxmlformats.org/wordprocessingml/2006/main" xmlns:m="http://schemas.openxmlformats.org/officeDocument/2006/math" xmlns:r="http://schemas.openxmlformats.org/officeDocument/2006/relationships" xmlns:o="urn:schemas-microsoft-com:office:office" xmlns:v="urn:schemas-microsoft-com:vml" xmlns:w10="urn:schemas-microsoft-com:office:word" xmlns:a="http://schemas.openxmlformats.org/drawingml/2006/main" xmlns:pic="http://schemas.openxmlformats.org/drawingml/2006/picture" xmlns:wp="http://schemas.openxmlformats.org/drawingml/2006/wordprocessingDrawing">
+<w:document xmlns:w="http://schemas.openxmlformats.org/wordprocessingml/2006/main" xmlns:m="http://schemas.openxmlformats.org/officeDocument/2006/math" xmlns:r="http://schemas.openxmlformats.org/officeDocument/2006/relationships" xmlns:o="urn:schemas-microsoft-com:office:office" xmlns:v="urn:schemas-microsoft-com:vml" xmlns:w10="urn:schemas-microsoft-com:office:word" xmlns:a="http://schemas.openxmlformats.org/drawingml/2006/main" xmlns:pic="http://schemas.openxmlformats.org/drawingml/2006/picture" xmlns:wp="http://schemas.openxmlformats.org/drawingml/2006/wordprocessingDrawing" xmlns:wpc="http://schemas.microsoft.com/office/word/2010/wordprocessingCanvas" xmlns:mc="http://schemas.openxmlformats.org/markup-compatibility/2006" xmlns:wp14="http://schemas.microsoft.com/office/word/2010/wordprocessingDrawing" xmlns:wpg="http://schemas.microsoft.com/office/word/2010/wordprocessingGroup" xmlns:wps="http://schemas.microsoft.com/office/word/2010/wordprocessingShape" mc:Ignorable="w14 w15 w16se w16cid w16 w16cex w16sdtdh w16sdtfl w16du wp14">
   <w:body>
     <w:bookmarkStart w:id="20" w:name="diagramme-de-test"/>
     <w:p>
@@ -14,18 +14,10 @@
     <w:p xmlns:w="http://schemas.openxmlformats.org/wordprocessingml/2006/main">
       <w:r>
         <w:drawing>
-          <wp:anchor xmlns:wp="http://schemas.openxmlformats.org/drawingml/2006/wordprocessingDrawing" distT="0" distB="0" distL="114300" distR="114300" simplePos="0" relativeHeight="251659264" behindDoc="0" locked="0" layoutInCell="1" allowOverlap="1">
-            <wp:simplePos x="0" y="0"/>
-            <wp:positionH relativeFrom="column">
-              <wp:posOffset>0</wp:posOffset>
-            </wp:positionH>
-            <wp:positionV relativeFrom="paragraph">
-              <wp:posOffset>0</wp:posOffset>
-            </wp:positionV>
-            <wp:extent cx="31242000" cy="4143375"/>
+          <wp:inline xmlns:wp="http://schemas.openxmlformats.org/drawingml/2006/wordprocessingDrawing" distT="0" distB="0" distL="0" distR="0">
+            <wp:extent cx="5943600" cy="910998"/>
             <wp:effectExtent l="0" t="0" r="0" b="0"/>
-            <wp:wrapNone/>
-            <wp:docPr id="1" name="Diagram"/>
+            <wp:docPr id="1" name="Diagram 1"/>
             <wp:cNvGraphicFramePr>
               <a:graphicFrameLocks xmlns:a="http://schemas.openxmlformats.org/drawingml/2006/main" noChangeAspect="1"/>
             </wp:cNvGraphicFramePr>
@@ -39,18 +31,18 @@
                   </wpc:bg>
                   <wpc:whole/>
                   <wpg:wgp xmlns:wpg="http://schemas.microsoft.com/office/word/2010/wordprocessingGroup" xmlns:wps="http://schemas.microsoft.com/office/word/2010/wordprocessingShape" xmlns:wp="http://schemas.openxmlformats.org/drawingml/2006/wordprocessingDrawing" xmlns:a="http://schemas.openxmlformats.org/drawingml/2006/main" xmlns:pic="http://schemas.openxmlformats.org/drawingml/2006/picture" xmlns:r="http://schemas.openxmlformats.org/officeDocument/2006/relationships" xmlns:w="http://schemas.openxmlformats.org/wordprocessingml/2006/main">
-                    <wpg:cNvPr id="1" name="Diagram"/>
+                    <wpg:cNvPr id="2" name="Diagram group 2"/>
                     <wpg:cNvGrpSpPr/>
                     <wpg:grpSpPr>
                       <a:xfrm>
                         <a:off x="0" y="0"/>
-                        <a:ext cx="31242000" cy="4143375"/>
+                        <a:ext cx="5943600" cy="910998"/>
                         <a:chOff x="0" y="0"/>
-                        <a:chExt cx="31242000" cy="4143375"/>
+                        <a:chExt cx="32004000" cy="4905375"/>
                       </a:xfrm>
                     </wpg:grpSpPr>
                     <wpg:grpSp>
-                      <wpg:cNvPr id="26" name="1. Dcl Adjv Aqtqifvux Pdmdx"/>
+                      <wpg:cNvPr id="3" name="1. Dcl Adjv Aqtqifvux Pdmdx"/>
                       <wpg:cNvGrpSpPr/>
                       <wpg:grpSpPr>
                         <a:xfrm>
@@ -61,7 +53,7 @@
                         </a:xfrm>
                       </wpg:grpSpPr>
                       <wps:wsp>
-                        <wps:cNvPr id="27" name="SubgraphTitle"/>
+                        <wps:cNvPr id="4" name="SubgraphTitle"/>
                         <wps:cNvSpPr/>
                         <wps:spPr>
                           <a:xfrm>
@@ -83,7 +75,10 @@
                                 <w:jc w:val="center"/>
                               </w:pPr>
                               <w:r>
-                                <w:t>1. Dcl Adjv Aqtqifvux Pdmdx</w:t>
+                                <w:rPr>
+                                  <w:color w:val="000000"/>
+                                </w:rPr>
+                                <w:t xml:space="preserve">1. Dcl Adjv Aqtqifvux Pdmdx</w:t>
                               </w:r>
                             </w:p>
                           </w:txbxContent>
@@ -92,7 +87,7 @@
                       </wps:wsp>
                     </wpg:grpSp>
                     <wpg:grpSp>
-                      <wpg:cNvPr id="28" name="2. Bhgwangl Mrnhw Szwpapvmrgoo Pdmdx"/>
+                      <wpg:cNvPr id="5" name="2. Bhgwangl Mrnhw Szwpapvmrgoo Pdmdx"/>
                       <wpg:cNvGrpSpPr/>
                       <wpg:grpSpPr>
                         <a:xfrm>
@@ -103,7 +98,7 @@
                         </a:xfrm>
                       </wpg:grpSpPr>
                       <wps:wsp>
-                        <wps:cNvPr id="29" name="SubgraphTitle"/>
+                        <wps:cNvPr id="6" name="SubgraphTitle"/>
                         <wps:cNvSpPr/>
                         <wps:spPr>
                           <a:xfrm>
@@ -125,7 +120,10 @@
                                 <w:jc w:val="center"/>
                               </w:pPr>
                               <w:r>
-                                <w:t>2. Bhgwangl Mrnhw Szwpapvmrgoo Pdmdx</w:t>
+                                <w:rPr>
+                                  <w:color w:val="000000"/>
+                                </w:rPr>
+                                <w:t xml:space="preserve">2. Bhgwangl Mrnhw Szwpapvmrgoo Pdmdx</w:t>
                               </w:r>
                             </w:p>
                           </w:txbxContent>
@@ -134,7 +132,7 @@
                       </wps:wsp>
                     </wpg:grpSp>
                     <wpg:grpSp>
-                      <wpg:cNvPr id="30" name="Dldl Xpxjxhbthl: Pvzqahyhbyvlra, Bnqtafeyowgb &amp; Mktpccerxcm Yrskupij"/>
+                      <wpg:cNvPr id="7" name="Dldl Xpxjxhbthl: Pvzqahyhbyvlra, Bnqtafeyowgb &amp; Mktpccerxcm Yrskupij"/>
                       <wpg:cNvGrpSpPr/>
                       <wpg:grpSpPr>
                         <a:xfrm>
@@ -145,7 +143,7 @@
                         </a:xfrm>
                       </wpg:grpSpPr>
                       <wps:wsp>
-                        <wps:cNvPr id="31" name="SubgraphTitle"/>
+                        <wps:cNvPr id="8" name="SubgraphTitle"/>
                         <wps:cNvSpPr/>
                         <wps:spPr>
                           <a:xfrm>
@@ -167,7 +165,10 @@
                                 <w:jc w:val="center"/>
                               </w:pPr>
                               <w:r>
-                                <w:t>Dldl Xpxjxhbthl: Pvzqahyhbyvlra, Bnqtafeyowgb &amp; Mktpccerxcm Yrskupij</w:t>
+                                <w:rPr>
+                                  <w:color w:val="000000"/>
+                                </w:rPr>
+                                <w:t xml:space="preserve">Dldl Xpxjxhbthl: Pvzqahyhbyvlra, Bnqtafeyowgb &amp; Mktpccerxcm Yrskupij</w:t>
                               </w:r>
                             </w:p>
                           </w:txbxContent>
@@ -176,7 +177,7 @@
                       </wps:wsp>
                     </wpg:grpSp>
                     <wpg:grpSp>
-                      <wpg:cNvPr id="32" name="3-5. Zqanykds &amp; Bnqtafeyowgb Vwywkk"/>
+                      <wpg:cNvPr id="9" name="3-5. Zqanykds &amp; Bnqtafeyowgb Vwywkk"/>
                       <wpg:cNvGrpSpPr/>
                       <wpg:grpSpPr>
                         <a:xfrm>
@@ -187,7 +188,7 @@
                         </a:xfrm>
                       </wpg:grpSpPr>
                       <wps:wsp>
-                        <wps:cNvPr id="33" name="SubgraphTitle"/>
+                        <wps:cNvPr id="10" name="SubgraphTitle"/>
                         <wps:cNvSpPr/>
                         <wps:spPr>
                           <a:xfrm>
@@ -209,7 +210,10 @@
                                 <w:jc w:val="center"/>
                               </w:pPr>
                               <w:r>
-                                <w:t>3-5. Zqanykds &amp; Bnqtafeyowgb Vwywkk</w:t>
+                                <w:rPr>
+                                  <w:color w:val="000000"/>
+                                </w:rPr>
+                                <w:t xml:space="preserve">3-5. Zqanykds &amp; Bnqtafeyowgb Vwywkk</w:t>
                               </w:r>
                             </w:p>
                           </w:txbxContent>
@@ -218,7 +222,7 @@
                       </wps:wsp>
                     </wpg:grpSp>
                     <wpg:grpSp>
-                      <wpg:cNvPr id="34" name="6 &amp; 8. Mktpccerxcm Yrskupij &amp; Yhip Iczvdvrjqkp"/>
+                      <wpg:cNvPr id="11" name="6 &amp; 8. Mktpccerxcm Yrskupij &amp; Yhip Iczvdvrjqkp"/>
                       <wpg:cNvGrpSpPr/>
                       <wpg:grpSpPr>
                         <a:xfrm>
@@ -229,7 +233,7 @@
                         </a:xfrm>
                       </wpg:grpSpPr>
                       <wps:wsp>
-                        <wps:cNvPr id="35" name="SubgraphTitle"/>
+                        <wps:cNvPr id="12" name="SubgraphTitle"/>
                         <wps:cNvSpPr/>
                         <wps:spPr>
                           <a:xfrm>
@@ -251,7 +255,10 @@
                                 <w:jc w:val="center"/>
                               </w:pPr>
                               <w:r>
-                                <w:t>6 &amp; 8. Mktpccerxcm Yrskupij &amp; Yhip Iczvdvrjqkp</w:t>
+                                <w:rPr>
+                                  <w:color w:val="000000"/>
+                                </w:rPr>
+                                <w:t xml:space="preserve">6 &amp; 8. Mktpccerxcm Yrskupij &amp; Yhip Iczvdvrjqkp</w:t>
                               </w:r>
                             </w:p>
                           </w:txbxContent>
@@ -260,7 +267,7 @@
                       </wps:wsp>
                     </wpg:grpSp>
                     <wpg:grpSp>
-                      <wpg:cNvPr id="36" name="6. Mktpccerxcm Qcls Iblouzkhkx (Mrnhw NAH)"/>
+                      <wpg:cNvPr id="13" name="6. Mktpccerxcm Qcls Iblouzkhkx (Mrnhw NAH)"/>
                       <wpg:cNvGrpSpPr/>
                       <wpg:grpSpPr>
                         <a:xfrm>
@@ -271,7 +278,7 @@
                         </a:xfrm>
                       </wpg:grpSpPr>
                       <wps:wsp>
-                        <wps:cNvPr id="37" name="SubgraphTitle"/>
+                        <wps:cNvPr id="14" name="SubgraphTitle"/>
                         <wps:cNvSpPr/>
                         <wps:spPr>
                           <a:xfrm>
@@ -293,7 +300,10 @@
                                 <w:jc w:val="center"/>
                               </w:pPr>
                               <w:r>
-                                <w:t>6. Mktpccerxcm Qcls Iblouzkhkx (Mrnhw NAH)</w:t>
+                                <w:rPr>
+                                  <w:color w:val="000000"/>
+                                </w:rPr>
+                                <w:t xml:space="preserve">6. Mktpccerxcm Qcls Iblouzkhkx (Mrnhw NAH)</w:t>
                               </w:r>
                             </w:p>
                           </w:txbxContent>
@@ -302,7 +312,7 @@
                       </wps:wsp>
                     </wpg:grpSp>
                     <wpg:grpSp>
-                      <wpg:cNvPr id="38" name="Erxriuy Laqrnarxe &amp; Bhgwangl Dvhsxcjp"/>
+                      <wpg:cNvPr id="15" name="Erxriuy Laqrnarxe &amp; Bhgwangl Dvhsxcjp"/>
                       <wpg:cNvGrpSpPr/>
                       <wpg:grpSpPr>
                         <a:xfrm>
@@ -313,7 +323,7 @@
                         </a:xfrm>
                       </wpg:grpSpPr>
                       <wps:wsp>
-                        <wps:cNvPr id="39" name="SubgraphTitle"/>
+                        <wps:cNvPr id="16" name="SubgraphTitle"/>
                         <wps:cNvSpPr/>
                         <wps:spPr>
                           <a:xfrm>
@@ -335,7 +345,10 @@
                                 <w:jc w:val="center"/>
                               </w:pPr>
                               <w:r>
-                                <w:t>Erxriuy Laqrnarxe &amp; Bhgwangl Dvhsxcjp</w:t>
+                                <w:rPr>
+                                  <w:color w:val="000000"/>
+                                </w:rPr>
+                                <w:t xml:space="preserve">Erxriuy Laqrnarxe &amp; Bhgwangl Dvhsxcjp</w:t>
                               </w:r>
                             </w:p>
                           </w:txbxContent>
@@ -344,7 +357,7 @@
                       </wps:wsp>
                     </wpg:grpSp>
                     <wpg:grpSp>
-                      <wpg:cNvPr id="40" name="9. Erxriuy Pvzqahyhbyvlra Pdmdx"/>
+                      <wpg:cNvPr id="17" name="9. Erxriuy Pvzqahyhbyvlra Pdmdx"/>
                       <wpg:cNvGrpSpPr/>
                       <wpg:grpSpPr>
                         <a:xfrm>
@@ -355,7 +368,7 @@
                         </a:xfrm>
                       </wpg:grpSpPr>
                       <wps:wsp>
-                        <wps:cNvPr id="41" name="SubgraphTitle"/>
+                        <wps:cNvPr id="18" name="SubgraphTitle"/>
                         <wps:cNvSpPr/>
                         <wps:spPr>
                           <a:xfrm>
@@ -377,7 +390,10 @@
                                 <w:jc w:val="center"/>
                               </w:pPr>
                               <w:r>
-                                <w:t>9. Erxriuy Pvzqahyhbyvlra Pdmdx</w:t>
+                                <w:rPr>
+                                  <w:color w:val="000000"/>
+                                </w:rPr>
+                                <w:t xml:space="preserve">9. Erxriuy Pvzqahyhbyvlra Pdmdx</w:t>
                               </w:r>
                             </w:p>
                           </w:txbxContent>
@@ -386,7 +402,7 @@
                       </wps:wsp>
                     </wpg:grpSp>
                     <wpg:grpSp>
-                      <wpg:cNvPr id="42" name="10. Erxriuy Dvhsxcjp &amp; Bhgwangl Lnquwua Pdmdx"/>
+                      <wpg:cNvPr id="19" name="10. Erxriuy Dvhsxcjp &amp; Bhgwangl Lnquwua Pdmdx"/>
                       <wpg:cNvGrpSpPr/>
                       <wpg:grpSpPr>
                         <a:xfrm>
@@ -397,7 +413,7 @@
                         </a:xfrm>
                       </wpg:grpSpPr>
                       <wps:wsp>
-                        <wps:cNvPr id="43" name="SubgraphTitle"/>
+                        <wps:cNvPr id="20" name="SubgraphTitle"/>
                         <wps:cNvSpPr/>
                         <wps:spPr>
                           <a:xfrm>
@@ -419,7 +435,10 @@
                                 <w:jc w:val="center"/>
                               </w:pPr>
                               <w:r>
-                                <w:t>10. Erxriuy Dvhsxcjp &amp; Bhgwangl Lnquwua Pdmdx</w:t>
+                                <w:rPr>
+                                  <w:color w:val="000000"/>
+                                </w:rPr>
+                                <w:t xml:space="preserve">10. Erxriuy Dvhsxcjp &amp; Bhgwangl Lnquwua Pdmdx</w:t>
                               </w:r>
                             </w:p>
                           </w:txbxContent>
@@ -428,7 +447,7 @@
                       </wps:wsp>
                     </wpg:grpSp>
                     <wpg:grpSp>
-                      <wpg:cNvPr id="44" name="Nmhbgc"/>
+                      <wpg:cNvPr id="21" name="Nmhbgc"/>
                       <wpg:cNvGrpSpPr/>
                       <wpg:grpSpPr>
                         <a:xfrm>
@@ -439,7 +458,7 @@
                         </a:xfrm>
                       </wpg:grpSpPr>
                       <wps:wsp>
-                        <wps:cNvPr id="45" name="SubgraphTitle"/>
+                        <wps:cNvPr id="22" name="SubgraphTitle"/>
                         <wps:cNvSpPr/>
                         <wps:spPr>
                           <a:xfrm>
@@ -461,7 +480,10 @@
                                 <w:jc w:val="center"/>
                               </w:pPr>
                               <w:r>
-                                <w:t>Nmhbgc</w:t>
+                                <w:rPr>
+                                  <w:color w:val="000000"/>
+                                </w:rPr>
+                                <w:t xml:space="preserve">Nmhbgc</w:t>
                               </w:r>
                             </w:p>
                           </w:txbxContent>
@@ -470,7 +492,7 @@
                       </wps:wsp>
                     </wpg:grpSp>
                     <wps:wsp>
-                      <wps:cNvPr id="2" name="Gnqjmqqpr / AQLz"/>
+                      <wps:cNvPr id="23" name="Gnqjmqqpr / AQLz"/>
                       <wps:cNvSpPr/>
                       <wps:spPr>
                         <a:xfrm>
@@ -483,6 +505,12 @@
                         <a:solidFill>
                           <a:srgbClr val="D9E2F3"/>
                         </a:solidFill>
+                        <a:ln w="12700" cap="flat" cmpd="sng" algn="ctr">
+                          <a:solidFill>
+                            <a:srgbClr val="2F5496"/>
+                          </a:solidFill>
+                          <a:prstDash val="solid"/>
+                        </a:ln>
                       </wps:spPr>
                       <wps:style>
                         <a:lnRef idx="2">
@@ -507,7 +535,10 @@
                               <w:jc w:val="center"/>
                             </w:pPr>
                             <w:r>
-                              <w:t>Gnqjmqqpr / AQLz</w:t>
+                              <w:rPr>
+                                <w:color w:val="000000"/>
+                              </w:rPr>
+                              <w:t xml:space="preserve">Gnqjmqqpr / AQLz</w:t>
                             </w:r>
                           </w:p>
                         </w:txbxContent>
@@ -520,7 +551,7 @@
                       </wps:bodyPr>
                     </wps:wsp>
                     <wps:wsp>
-                      <wps:cNvPr id="3" name="Jngmcmluw Mxdzqvhhz"/>
+                      <wps:cNvPr id="24" name="Jngmcmluw Mxdzqvhhz"/>
                       <wps:cNvSpPr/>
                       <wps:spPr>
                         <a:xfrm>
@@ -533,6 +564,12 @@
                         <a:solidFill>
                           <a:srgbClr val="D9E2F3"/>
                         </a:solidFill>
+                        <a:ln w="12700" cap="flat" cmpd="sng" algn="ctr">
+                          <a:solidFill>
+                            <a:srgbClr val="2F5496"/>
+                          </a:solidFill>
+                          <a:prstDash val="solid"/>
+                        </a:ln>
                       </wps:spPr>
                       <wps:style>
                         <a:lnRef idx="2">
@@ -557,7 +594,10 @@
                               <w:jc w:val="center"/>
                             </w:pPr>
                             <w:r>
-                              <w:t>Jngmcmluw Mxdzqvhhz</w:t>
+                              <w:rPr>
+                                <w:color w:val="000000"/>
+                              </w:rPr>
+                              <w:t xml:space="preserve">Jngmcmluw Mxdzqvhhz</w:t>
                             </w:r>
                           </w:p>
                         </w:txbxContent>
@@ -570,7 +610,7 @@
                       </wps:bodyPr>
                     </wps:wsp>
                     <wps:wsp>
-                      <wps:cNvPr id="4" name="Aqtqifvux Cguqrxa"/>
+                      <wps:cNvPr id="25" name="Aqtqifvux Cguqrxa"/>
                       <wps:cNvSpPr/>
                       <wps:spPr>
                         <a:xfrm>
@@ -583,6 +623,12 @@
                         <a:solidFill>
                           <a:srgbClr val="D9E2F3"/>
                         </a:solidFill>
+                        <a:ln w="12700" cap="flat" cmpd="sng" algn="ctr">
+                          <a:solidFill>
+                            <a:srgbClr val="2F5496"/>
+                          </a:solidFill>
+                          <a:prstDash val="solid"/>
+                        </a:ln>
                       </wps:spPr>
                       <wps:style>
                         <a:lnRef idx="2">
@@ -607,7 +653,10 @@
                               <w:jc w:val="center"/>
                             </w:pPr>
                             <w:r>
-                              <w:t>Aqtqifvux Cguqrxa</w:t>
+                              <w:rPr>
+                                <w:color w:val="000000"/>
+                              </w:rPr>
+                              <w:t xml:space="preserve">Aqtqifvux Cguqrxa</w:t>
                             </w:r>
                           </w:p>
                         </w:txbxContent>
@@ -620,7 +669,7 @@
                       </wps:bodyPr>
                     </wps:wsp>
                     <wps:wsp>
-                      <wps:cNvPr id="5" name="Kapsgahlhzf Brhqtfq&lt;br/&gt;ezi, mau, ynu, aqvi, mpwioja"/>
+                      <wps:cNvPr id="26" name="Kapsgahlhzf Brhqtfq&lt;br/&gt;ezi, mau, ynu, aqvi, mpwioja"/>
                       <wps:cNvSpPr/>
                       <wps:spPr>
                         <a:xfrm>
@@ -633,6 +682,12 @@
                         <a:solidFill>
                           <a:srgbClr val="D9E2F3"/>
                         </a:solidFill>
+                        <a:ln w="12700" cap="flat" cmpd="sng" algn="ctr">
+                          <a:solidFill>
+                            <a:srgbClr val="2F5496"/>
+                          </a:solidFill>
+                          <a:prstDash val="solid"/>
+                        </a:ln>
                       </wps:spPr>
                       <wps:style>
                         <a:lnRef idx="2">
@@ -657,7 +712,10 @@
                               <w:jc w:val="center"/>
                             </w:pPr>
                             <w:r>
-                              <w:t>Kapsgahlhzf Brhqtfq&lt;br/&gt;ezi, mau, ynu, aqvi, mpwioja</w:t>
+                              <w:rPr>
+                                <w:color w:val="000000"/>
+                              </w:rPr>
+                              <w:t xml:space="preserve">Kapsgahlhzf Brhqtfq&lt;br/&gt;ezi, mau, ynu, aqvi, mpwioja</w:t>
                             </w:r>
                           </w:p>
                         </w:txbxContent>
@@ -670,7 +728,7 @@
                       </wps:bodyPr>
                     </wps:wsp>
                     <wps:wsp>
-                      <wps:cNvPr id="6" name="Hlbt Ekaregrm&lt;br/&gt;nzom_agztdtss"/>
+                      <wps:cNvPr id="27" name="Hlbt Ekaregrm&lt;br/&gt;nzom_agztdtss"/>
                       <wps:cNvSpPr/>
                       <wps:spPr>
                         <a:xfrm>
@@ -683,6 +741,12 @@
                         <a:solidFill>
                           <a:srgbClr val="D9E2F3"/>
                         </a:solidFill>
+                        <a:ln w="12700" cap="flat" cmpd="sng" algn="ctr">
+                          <a:solidFill>
+                            <a:srgbClr val="2F5496"/>
+                          </a:solidFill>
+                          <a:prstDash val="solid"/>
+                        </a:ln>
                       </wps:spPr>
                       <wps:style>
                         <a:lnRef idx="2">
@@ -707,7 +771,10 @@
                               <w:jc w:val="center"/>
                             </w:pPr>
                             <w:r>
-                              <w:t>Hlbt Ekaregrm&lt;br/&gt;nzom_agztdtss</w:t>
+                              <w:rPr>
+                                <w:color w:val="000000"/>
+                              </w:rPr>
+                              <w:t xml:space="preserve">Hlbt Ekaregrm&lt;br/&gt;nzom_agztdtss</w:t>
                             </w:r>
                           </w:p>
                         </w:txbxContent>
@@ -720,7 +787,7 @@
                       </wps:bodyPr>
                     </wps:wsp>
                     <wps:wsp>
-                      <wps:cNvPr id="7" name="Rhxqkgz Wbnypu Njogvnq"/>
+                      <wps:cNvPr id="28" name="Rhxqkgz Wbnypu Njogvnq"/>
                       <wps:cNvSpPr/>
                       <wps:spPr>
                         <a:xfrm>
@@ -733,6 +800,12 @@
                         <a:solidFill>
                           <a:srgbClr val="D9E2F3"/>
                         </a:solidFill>
+                        <a:ln w="12700" cap="flat" cmpd="sng" algn="ctr">
+                          <a:solidFill>
+                            <a:srgbClr val="2F5496"/>
+                          </a:solidFill>
+                          <a:prstDash val="solid"/>
+                        </a:ln>
                       </wps:spPr>
                       <wps:style>
                         <a:lnRef idx="2">
@@ -757,7 +830,10 @@
                               <w:jc w:val="center"/>
                             </w:pPr>
                             <w:r>
-                              <w:t>Rhxqkgz Wbnypu Njogvnq</w:t>
+                              <w:rPr>
+                                <w:color w:val="000000"/>
+                              </w:rPr>
+                              <w:t xml:space="preserve">Rhxqkgz Wbnypu Njogvnq</w:t>
                             </w:r>
                           </w:p>
                         </w:txbxContent>
@@ -770,7 +846,7 @@
                       </wps:bodyPr>
                     </wps:wsp>
                     <wps:wsp>
-                      <wps:cNvPr id="8" name="Bhgwangl Mrnhw Wbnypu&lt;br/&gt;deei/lamr mpxalugo, umcd_fivln, c_duepu/lse"/>
+                      <wps:cNvPr id="29" name="Bhgwangl Mrnhw Wbnypu&lt;br/&gt;deei/lamr mpxalugo, umcd_fivln, c_duepu/lse"/>
                       <wps:cNvSpPr/>
                       <wps:spPr>
                         <a:xfrm>
@@ -783,6 +859,12 @@
                         <a:solidFill>
                           <a:srgbClr val="D9E2F3"/>
                         </a:solidFill>
+                        <a:ln w="12700" cap="flat" cmpd="sng" algn="ctr">
+                          <a:solidFill>
+                            <a:srgbClr val="2F5496"/>
+                          </a:solidFill>
+                          <a:prstDash val="solid"/>
+                        </a:ln>
                       </wps:spPr>
                       <wps:style>
                         <a:lnRef idx="2">
@@ -807,7 +889,10 @@
                               <w:jc w:val="center"/>
                             </w:pPr>
                             <w:r>
-                              <w:t>Bhgwangl Mrnhw Wbnypu&lt;br/&gt;deei/lamr mpxalugo, umcd_fivln, c_duepu/lse</w:t>
+                              <w:rPr>
+                                <w:color w:val="000000"/>
+                              </w:rPr>
+                              <w:t xml:space="preserve">Bhgwangl Mrnhw Wbnypu&lt;br/&gt;deei/lamr mpxalugo, umcd_fivln, c_duepu/lse</w:t>
                             </w:r>
                           </w:p>
                         </w:txbxContent>
@@ -820,7 +905,7 @@
                       </wps:bodyPr>
                     </wps:wsp>
                     <wps:wsp>
-                      <wps:cNvPr id="9" name="3. TMN Zqanykds&lt;br/&gt;Cqiogds Pjyskpt"/>
+                      <wps:cNvPr id="30" name="3. TMN Zqanykds&lt;br/&gt;Cqiogds Pjyskpt"/>
                       <wps:cNvSpPr/>
                       <wps:spPr>
                         <a:xfrm>
@@ -833,6 +918,12 @@
                         <a:solidFill>
                           <a:srgbClr val="D9E2F3"/>
                         </a:solidFill>
+                        <a:ln w="12700" cap="flat" cmpd="sng" algn="ctr">
+                          <a:solidFill>
+                            <a:srgbClr val="2F5496"/>
+                          </a:solidFill>
+                          <a:prstDash val="solid"/>
+                        </a:ln>
                       </wps:spPr>
                       <wps:style>
                         <a:lnRef idx="2">
@@ -857,7 +948,10 @@
                               <w:jc w:val="center"/>
                             </w:pPr>
                             <w:r>
-                              <w:t>3. TMN Zqanykds&lt;br/&gt;Cqiogds Pjyskpt</w:t>
+                              <w:rPr>
+                                <w:color w:val="000000"/>
+                              </w:rPr>
+                              <w:t xml:space="preserve">3. TMN Zqanykds&lt;br/&gt;Cqiogds Pjyskpt</w:t>
                             </w:r>
                           </w:p>
                         </w:txbxContent>
@@ -870,7 +964,7 @@
                       </wps:bodyPr>
                     </wps:wsp>
                     <wps:wsp>
-                      <wps:cNvPr id="10" name="Hlbt Rrcsfnbksv"/>
+                      <wps:cNvPr id="31" name="Hlbt Rrcsfnbksv"/>
                       <wps:cNvSpPr/>
                       <wps:spPr>
                         <a:xfrm>
@@ -883,6 +977,12 @@
                         <a:solidFill>
                           <a:srgbClr val="D9E2F3"/>
                         </a:solidFill>
+                        <a:ln w="12700" cap="flat" cmpd="sng" algn="ctr">
+                          <a:solidFill>
+                            <a:srgbClr val="2F5496"/>
+                          </a:solidFill>
+                          <a:prstDash val="solid"/>
+                        </a:ln>
                       </wps:spPr>
                       <wps:style>
                         <a:lnRef idx="2">
@@ -907,7 +1007,10 @@
                               <w:jc w:val="center"/>
                             </w:pPr>
                             <w:r>
-                              <w:t>Hlbt Rrcsfnbksv</w:t>
+                              <w:rPr>
+                                <w:color w:val="000000"/>
+                              </w:rPr>
+                              <w:t xml:space="preserve">Hlbt Rrcsfnbksv</w:t>
                             </w:r>
                           </w:p>
                         </w:txbxContent>
@@ -920,7 +1023,7 @@
                       </wps:bodyPr>
                     </wps:wsp>
                     <wps:wsp>
-                      <wps:cNvPr id="11" name="4. Yhip Yryvbgl &amp; Bnqtafeyowgb"/>
+                      <wps:cNvPr id="32" name="4. Yhip Yryvbgl &amp; Bnqtafeyowgb"/>
                       <wps:cNvSpPr/>
                       <wps:spPr>
                         <a:xfrm>
@@ -933,6 +1036,12 @@
                         <a:solidFill>
                           <a:srgbClr val="D9E2F3"/>
                         </a:solidFill>
+                        <a:ln w="12700" cap="flat" cmpd="sng" algn="ctr">
+                          <a:solidFill>
+                            <a:srgbClr val="2F5496"/>
+                          </a:solidFill>
+                          <a:prstDash val="solid"/>
+                        </a:ln>
                       </wps:spPr>
                       <wps:style>
                         <a:lnRef idx="2">
@@ -957,7 +1066,10 @@
                               <w:jc w:val="center"/>
                             </w:pPr>
                             <w:r>
-                              <w:t>4. Yhip Yryvbgl &amp; Bnqtafeyowgb</w:t>
+                              <w:rPr>
+                                <w:color w:val="000000"/>
+                              </w:rPr>
+                              <w:t xml:space="preserve">4. Yhip Yryvbgl &amp; Bnqtafeyowgb</w:t>
                             </w:r>
                           </w:p>
                         </w:txbxContent>
@@ -970,7 +1082,7 @@
                       </wps:bodyPr>
                     </wps:wsp>
                     <wps:wsp>
-                      <wps:cNvPr id="12" name="Hlbt Yhip Hefaki &amp;&lt;br/&gt;Jtjg Xqwvx Ztp-H"/>
+                      <wps:cNvPr id="33" name="Hlbt Yhip Hefaki &amp;&lt;br/&gt;Jtjg Xqwvx Ztp-H"/>
                       <wps:cNvSpPr/>
                       <wps:spPr>
                         <a:xfrm>
@@ -983,6 +1095,12 @@
                         <a:solidFill>
                           <a:srgbClr val="D9E2F3"/>
                         </a:solidFill>
+                        <a:ln w="12700" cap="flat" cmpd="sng" algn="ctr">
+                          <a:solidFill>
+                            <a:srgbClr val="2F5496"/>
+                          </a:solidFill>
+                          <a:prstDash val="solid"/>
+                        </a:ln>
                       </wps:spPr>
                       <wps:style>
                         <a:lnRef idx="2">
@@ -1007,7 +1125,10 @@
                               <w:jc w:val="center"/>
                             </w:pPr>
                             <w:r>
-                              <w:t>Hlbt Yhip Hefaki &amp;&lt;br/&gt;Jtjg Xqwvx Ztp-H</w:t>
+                              <w:rPr>
+                                <w:color w:val="000000"/>
+                              </w:rPr>
+                              <w:t xml:space="preserve">Hlbt Yhip Hefaki &amp;&lt;br/&gt;Jtjg Xqwvx Ztp-H</w:t>
                             </w:r>
                           </w:p>
                         </w:txbxContent>
@@ -1020,7 +1141,7 @@
                       </wps:bodyPr>
                     </wps:wsp>
                     <wps:wsp>
-                      <wps:cNvPr id="13" name="5. Kpwmq Golpmjxb Uhbkesegbg"/>
+                      <wps:cNvPr id="34" name="5. Kpwmq Golpmjxb Uhbkesegbg"/>
                       <wps:cNvSpPr/>
                       <wps:spPr>
                         <a:xfrm>
@@ -1033,6 +1154,12 @@
                         <a:solidFill>
                           <a:srgbClr val="D9E2F3"/>
                         </a:solidFill>
+                        <a:ln w="12700" cap="flat" cmpd="sng" algn="ctr">
+                          <a:solidFill>
+                            <a:srgbClr val="2F5496"/>
+                          </a:solidFill>
+                          <a:prstDash val="solid"/>
+                        </a:ln>
                       </wps:spPr>
                       <wps:style>
                         <a:lnRef idx="2">
@@ -1057,7 +1184,10 @@
                               <w:jc w:val="center"/>
                             </w:pPr>
                             <w:r>
-                              <w:t>5. Kpwmq Golpmjxb Uhbkesegbg</w:t>
+                              <w:rPr>
+                                <w:color w:val="000000"/>
+                              </w:rPr>
+                              <w:t xml:space="preserve">5. Kpwmq Golpmjxb Uhbkesegbg</w:t>
                             </w:r>
                           </w:p>
                         </w:txbxContent>
@@ -1070,7 +1200,7 @@
                       </wps:bodyPr>
                     </wps:wsp>
                     <wps:wsp>
-                      <wps:cNvPr id="14" name="Golpmjxb Pvzqahyhbyvlra&lt;br/&gt;Xqwvx, Dfyhs, Rrcsfnbksv"/>
+                      <wps:cNvPr id="35" name="Golpmjxb Pvzqahyhbyvlra&lt;br/&gt;Xqwvx, Dfyhs, Rrcsfnbksv"/>
                       <wps:cNvSpPr/>
                       <wps:spPr>
                         <a:xfrm>
@@ -1083,6 +1213,12 @@
                         <a:solidFill>
                           <a:srgbClr val="D9E2F3"/>
                         </a:solidFill>
+                        <a:ln w="12700" cap="flat" cmpd="sng" algn="ctr">
+                          <a:solidFill>
+                            <a:srgbClr val="2F5496"/>
+                          </a:solidFill>
+                          <a:prstDash val="solid"/>
+                        </a:ln>
                       </wps:spPr>
                       <wps:style>
                         <a:lnRef idx="2">
@@ -1107,7 +1243,10 @@
                               <w:jc w:val="center"/>
                             </w:pPr>
                             <w:r>
-                              <w:t>Golpmjxb Pvzqahyhbyvlra&lt;br/&gt;Xqwvx, Dfyhs, Rrcsfnbksv</w:t>
+                              <w:rPr>
+                                <w:color w:val="000000"/>
+                              </w:rPr>
+                              <w:t xml:space="preserve">Golpmjxb Pvzqahyhbyvlra&lt;br/&gt;Xqwvx, Dfyhs, Rrcsfnbksv</w:t>
                             </w:r>
                           </w:p>
                         </w:txbxContent>
@@ -1120,7 +1259,7 @@
                       </wps:bodyPr>
                     </wps:wsp>
                     <wps:wsp>
-                      <wps:cNvPr id="15" name="Lqlqpbcdq Ewztn"/>
+                      <wps:cNvPr id="36" name="Lqlqpbcdq Ewztn"/>
                       <wps:cNvSpPr/>
                       <wps:spPr>
                         <a:xfrm>
@@ -1133,6 +1272,12 @@
                         <a:solidFill>
                           <a:srgbClr val="D9E2F3"/>
                         </a:solidFill>
+                        <a:ln w="12700" cap="flat" cmpd="sng" algn="ctr">
+                          <a:solidFill>
+                            <a:srgbClr val="2F5496"/>
+                          </a:solidFill>
+                          <a:prstDash val="solid"/>
+                        </a:ln>
                       </wps:spPr>
                       <wps:style>
                         <a:lnRef idx="2">
@@ -1157,7 +1302,10 @@
                               <w:jc w:val="center"/>
                             </w:pPr>
                             <w:r>
-                              <w:t>Lqlqpbcdq Ewztn</w:t>
+                              <w:rPr>
+                                <w:color w:val="000000"/>
+                              </w:rPr>
+                              <w:t xml:space="preserve">Lqlqpbcdq Ewztn</w:t>
                             </w:r>
                           </w:p>
                         </w:txbxContent>
@@ -1170,7 +1318,7 @@
                       </wps:bodyPr>
                     </wps:wsp>
                     <wps:wsp>
-                      <wps:cNvPr id="16" name="Lqlqpbcdq"/>
+                      <wps:cNvPr id="37" name="Lqlqpbcdq"/>
                       <wps:cNvSpPr/>
                       <wps:spPr>
                         <a:xfrm>
@@ -1183,6 +1331,12 @@
                         <a:solidFill>
                           <a:srgbClr val="D9E2F3"/>
                         </a:solidFill>
+                        <a:ln w="12700" cap="flat" cmpd="sng" algn="ctr">
+                          <a:solidFill>
+                            <a:srgbClr val="2F5496"/>
+                          </a:solidFill>
+                          <a:prstDash val="solid"/>
+                        </a:ln>
                       </wps:spPr>
                       <wps:style>
                         <a:lnRef idx="2">
@@ -1207,7 +1361,10 @@
                               <w:jc w:val="center"/>
                             </w:pPr>
                             <w:r>
-                              <w:t>Lqlqpbcdq</w:t>
+                              <w:rPr>
+                                <w:color w:val="000000"/>
+                              </w:rPr>
+                              <w:t xml:space="preserve">Lqlqpbcdq</w:t>
                             </w:r>
                           </w:p>
                         </w:txbxContent>
@@ -1220,7 +1377,7 @@
                       </wps:bodyPr>
                     </wps:wsp>
                     <wps:wsp>
-                      <wps:cNvPr id="17" name="Eikeaqpem Dfyhs &amp; Hefaki"/>
+                      <wps:cNvPr id="38" name="Eikeaqpem Dfyhs &amp; Hefaki"/>
                       <wps:cNvSpPr/>
                       <wps:spPr>
                         <a:xfrm>
@@ -1233,6 +1390,12 @@
                         <a:solidFill>
                           <a:srgbClr val="D9E2F3"/>
                         </a:solidFill>
+                        <a:ln w="12700" cap="flat" cmpd="sng" algn="ctr">
+                          <a:solidFill>
+                            <a:srgbClr val="2F5496"/>
+                          </a:solidFill>
+                          <a:prstDash val="solid"/>
+                        </a:ln>
                       </wps:spPr>
                       <wps:style>
                         <a:lnRef idx="2">
@@ -1257,7 +1420,10 @@
                               <w:jc w:val="center"/>
                             </w:pPr>
                             <w:r>
-                              <w:t>Eikeaqpem Dfyhs &amp; Hefaki</w:t>
+                              <w:rPr>
+                                <w:color w:val="000000"/>
+                              </w:rPr>
+                              <w:t xml:space="preserve">Eikeaqpem Dfyhs &amp; Hefaki</w:t>
                             </w:r>
                           </w:p>
                         </w:txbxContent>
@@ -1270,7 +1436,7 @@
                       </wps:bodyPr>
                     </wps:wsp>
                     <wps:wsp>
-                      <wps:cNvPr id="18" name="Uqmmfsqydmmdp"/>
+                      <wps:cNvPr id="39" name="Uqmmfsqydmmdp"/>
                       <wps:cNvSpPr/>
                       <wps:spPr>
                         <a:xfrm>
@@ -1283,6 +1449,12 @@
                         <a:solidFill>
                           <a:srgbClr val="D9E2F3"/>
                         </a:solidFill>
+                        <a:ln w="12700" cap="flat" cmpd="sng" algn="ctr">
+                          <a:solidFill>
+                            <a:srgbClr val="2F5496"/>
+                          </a:solidFill>
+                          <a:prstDash val="solid"/>
+                        </a:ln>
                       </wps:spPr>
                       <wps:style>
                         <a:lnRef idx="2">
@@ -1307,7 +1479,10 @@
                               <w:jc w:val="center"/>
                             </w:pPr>
                             <w:r>
-                              <w:t>Uqmmfsqydmmdp</w:t>
+                              <w:rPr>
+                                <w:color w:val="000000"/>
+                              </w:rPr>
+                              <w:t xml:space="preserve">Uqmmfsqydmmdp</w:t>
                             </w:r>
                           </w:p>
                         </w:txbxContent>
@@ -1320,7 +1495,7 @@
                       </wps:bodyPr>
                     </wps:wsp>
                     <wps:wsp>
-                      <wps:cNvPr id="19" name="Ryugwhet Ariwj"/>
+                      <wps:cNvPr id="40" name="Ryugwhet Ariwj"/>
                       <wps:cNvSpPr/>
                       <wps:spPr>
                         <a:xfrm>
@@ -1333,6 +1508,12 @@
                         <a:solidFill>
                           <a:srgbClr val="D9E2F3"/>
                         </a:solidFill>
+                        <a:ln w="12700" cap="flat" cmpd="sng" algn="ctr">
+                          <a:solidFill>
+                            <a:srgbClr val="2F5496"/>
+                          </a:solidFill>
+                          <a:prstDash val="solid"/>
+                        </a:ln>
                       </wps:spPr>
                       <wps:style>
                         <a:lnRef idx="2">
@@ -1357,7 +1538,10 @@
                               <w:jc w:val="center"/>
                             </w:pPr>
                             <w:r>
-                              <w:t>Ryugwhet Ariwj</w:t>
+                              <w:rPr>
+                                <w:color w:val="000000"/>
+                              </w:rPr>
+                              <w:t xml:space="preserve">Ryugwhet Ariwj</w:t>
                             </w:r>
                           </w:p>
                         </w:txbxContent>
@@ -1370,7 +1554,7 @@
                       </wps:bodyPr>
                     </wps:wsp>
                     <wps:wsp>
-                      <wps:cNvPr id="20" name="8. Yhip Iczvdvrjqkp &amp; Yryvbgl"/>
+                      <wps:cNvPr id="41" name="8. Yhip Iczvdvrjqkp &amp; Yryvbgl"/>
                       <wps:cNvSpPr/>
                       <wps:spPr>
                         <a:xfrm>
@@ -1383,6 +1567,12 @@
                         <a:solidFill>
                           <a:srgbClr val="D9E2F3"/>
                         </a:solidFill>
+                        <a:ln w="12700" cap="flat" cmpd="sng" algn="ctr">
+                          <a:solidFill>
+                            <a:srgbClr val="2F5496"/>
+                          </a:solidFill>
+                          <a:prstDash val="solid"/>
+                        </a:ln>
                       </wps:spPr>
                       <wps:style>
                         <a:lnRef idx="2">
@@ -1407,7 +1597,10 @@
                               <w:jc w:val="center"/>
                             </w:pPr>
                             <w:r>
-                              <w:t>8. Yhip Iczvdvrjqkp &amp; Yryvbgl</w:t>
+                              <w:rPr>
+                                <w:color w:val="000000"/>
+                              </w:rPr>
+                              <w:t xml:space="preserve">8. Yhip Iczvdvrjqkp &amp; Yryvbgl</w:t>
                             </w:r>
                           </w:p>
                         </w:txbxContent>
@@ -1420,7 +1613,7 @@
                       </wps:bodyPr>
                     </wps:wsp>
                     <wps:wsp>
-                      <wps:cNvPr id="21" name="Qcls &amp; Golpmjxb Yhip Hefaki"/>
+                      <wps:cNvPr id="42" name="Qcls &amp; Golpmjxb Yhip Hefaki"/>
                       <wps:cNvSpPr/>
                       <wps:spPr>
                         <a:xfrm>
@@ -1433,6 +1626,12 @@
                         <a:solidFill>
                           <a:srgbClr val="D9E2F3"/>
                         </a:solidFill>
+                        <a:ln w="12700" cap="flat" cmpd="sng" algn="ctr">
+                          <a:solidFill>
+                            <a:srgbClr val="2F5496"/>
+                          </a:solidFill>
+                          <a:prstDash val="solid"/>
+                        </a:ln>
                       </wps:spPr>
                       <wps:style>
                         <a:lnRef idx="2">
@@ -1457,7 +1656,10 @@
                               <w:jc w:val="center"/>
                             </w:pPr>
                             <w:r>
-                              <w:t>Qcls &amp; Golpmjxb Yhip Hefaki</w:t>
+                              <w:rPr>
+                                <w:color w:val="000000"/>
+                              </w:rPr>
+                              <w:t xml:space="preserve">Qcls &amp; Golpmjxb Yhip Hefaki</w:t>
                             </w:r>
                           </w:p>
                         </w:txbxContent>
@@ -1470,7 +1672,7 @@
                       </wps:bodyPr>
                     </wps:wsp>
                     <wps:wsp>
-                      <wps:cNvPr id="22" name="Erxriuy Ezfvqi Fgtyqsdg"/>
+                      <wps:cNvPr id="43" name="Erxriuy Ezfvqi Fgtyqsdg"/>
                       <wps:cNvSpPr/>
                       <wps:spPr>
                         <a:xfrm>
@@ -1483,6 +1685,12 @@
                         <a:solidFill>
                           <a:srgbClr val="D9E2F3"/>
                         </a:solidFill>
+                        <a:ln w="12700" cap="flat" cmpd="sng" algn="ctr">
+                          <a:solidFill>
+                            <a:srgbClr val="2F5496"/>
+                          </a:solidFill>
+                          <a:prstDash val="solid"/>
+                        </a:ln>
                       </wps:spPr>
                       <wps:style>
                         <a:lnRef idx="2">
@@ -1507,7 +1715,10 @@
                               <w:jc w:val="center"/>
                             </w:pPr>
                             <w:r>
-                              <w:t>Erxriuy Ezfvqi Fgtyqsdg</w:t>
+                              <w:rPr>
+                                <w:color w:val="000000"/>
+                              </w:rPr>
+                              <w:t xml:space="preserve">Erxriuy Ezfvqi Fgtyqsdg</w:t>
                             </w:r>
                           </w:p>
                         </w:txbxContent>
@@ -1520,7 +1731,7 @@
                       </wps:bodyPr>
                     </wps:wsp>
                     <wps:wsp>
-                      <wps:cNvPr id="23" name="Erxriuy Ezfvqi&lt;br/&gt;Xqwvx, Dfyhs, Ariwj, Fypq Wbnypu"/>
+                      <wps:cNvPr id="44" name="Erxriuy Ezfvqi&lt;br/&gt;Xqwvx, Dfyhs, Ariwj, Fypq Wbnypu"/>
                       <wps:cNvSpPr/>
                       <wps:spPr>
                         <a:xfrm>
@@ -1533,6 +1744,12 @@
                         <a:solidFill>
                           <a:srgbClr val="D9E2F3"/>
                         </a:solidFill>
+                        <a:ln w="12700" cap="flat" cmpd="sng" algn="ctr">
+                          <a:solidFill>
+                            <a:srgbClr val="2F5496"/>
+                          </a:solidFill>
+                          <a:prstDash val="solid"/>
+                        </a:ln>
                       </wps:spPr>
                       <wps:style>
                         <a:lnRef idx="2">
@@ -1557,7 +1774,10 @@
                               <w:jc w:val="center"/>
                             </w:pPr>
                             <w:r>
-                              <w:t>Erxriuy Ezfvqi&lt;br/&gt;Xqwvx, Dfyhs, Ariwj, Fypq Wbnypu</w:t>
+                              <w:rPr>
+                                <w:color w:val="000000"/>
+                              </w:rPr>
+                              <w:t xml:space="preserve">Erxriuy Ezfvqi&lt;br/&gt;Xqwvx, Dfyhs, Ariwj, Fypq Wbnypu</w:t>
                             </w:r>
                           </w:p>
                         </w:txbxContent>
@@ -1570,7 +1790,7 @@
                       </wps:bodyPr>
                     </wps:wsp>
                     <wps:wsp>
-                      <wps:cNvPr id="24" name="Bhgwangl Lnquwua &amp;&lt;br/&gt;Vldnbrkpcl Hufgwibl"/>
+                      <wps:cNvPr id="45" name="Bhgwangl Lnquwua &amp;&lt;br/&gt;Vldnbrkpcl Hufgwibl"/>
                       <wps:cNvSpPr/>
                       <wps:spPr>
                         <a:xfrm>
@@ -1583,6 +1803,12 @@
                         <a:solidFill>
                           <a:srgbClr val="D9E2F3"/>
                         </a:solidFill>
+                        <a:ln w="12700" cap="flat" cmpd="sng" algn="ctr">
+                          <a:solidFill>
+                            <a:srgbClr val="2F5496"/>
+                          </a:solidFill>
+                          <a:prstDash val="solid"/>
+                        </a:ln>
                       </wps:spPr>
                       <wps:style>
                         <a:lnRef idx="2">
@@ -1607,7 +1833,10 @@
                               <w:jc w:val="center"/>
                             </w:pPr>
                             <w:r>
-                              <w:t>Bhgwangl Lnquwua &amp;&lt;br/&gt;Vldnbrkpcl Hufgwibl</w:t>
+                              <w:rPr>
+                                <w:color w:val="000000"/>
+                              </w:rPr>
+                              <w:t xml:space="preserve">Bhgwangl Lnquwua &amp;&lt;br/&gt;Vldnbrkpcl Hufgwibl</w:t>
                             </w:r>
                           </w:p>
                         </w:txbxContent>
@@ -1620,7 +1849,7 @@
                       </wps:bodyPr>
                     </wps:wsp>
                     <wps:wsp>
-                      <wps:cNvPr id="25" name="Erxriuy Qgmzwpn&lt;br/&gt;Xdmnhhvkew Rzeel Bygarnbnp"/>
+                      <wps:cNvPr id="46" name="Erxriuy Qgmzwpn&lt;br/&gt;Xdmnhhvkew Rzeel Bygarnbnp"/>
                       <wps:cNvSpPr/>
                       <wps:spPr>
                         <a:xfrm>
@@ -1633,6 +1862,12 @@
                         <a:solidFill>
                           <a:srgbClr val="D9E2F3"/>
                         </a:solidFill>
+                        <a:ln w="12700" cap="flat" cmpd="sng" algn="ctr">
+                          <a:solidFill>
+                            <a:srgbClr val="2F5496"/>
+                          </a:solidFill>
+                          <a:prstDash val="solid"/>
+                        </a:ln>
                       </wps:spPr>
                       <wps:style>
                         <a:lnRef idx="2">
@@ -1657,7 +1892,10 @@
                               <w:jc w:val="center"/>
                             </w:pPr>
                             <w:r>
-                              <w:t>Erxriuy Qgmzwpn&lt;br/&gt;Xdmnhhvkew Rzeel Bygarnbnp</w:t>
+                              <w:rPr>
+                                <w:color w:val="000000"/>
+                              </w:rPr>
+                              <w:t xml:space="preserve">Erxriuy Qgmzwpn&lt;br/&gt;Xdmnhhvkew Rzeel Bygarnbnp</w:t>
                             </w:r>
                           </w:p>
                         </w:txbxContent>
@@ -1670,50 +1908,26 @@
                       </wps:bodyPr>
                     </wps:wsp>
                     <wps:wsp>
-                      <wps:cNvPr id="46" name="Connector"/>
-                      <wps:cNvCnPr>
-                        <a:stCxn id="2" idx="2"/>
-                        <a:endCxn id="4" idx="4"/>
-                      </wps:cNvCnPr>
-                      <wps:spPr>
-                        <a:xfrm>
-                          <a:off x="571500" y="857250"/>
-                          <a:ext cx="1905000" cy="1143000"/>
-                        </a:xfrm>
-                        <a:prstGeom prst="line">
-                          <a:avLst/>
-                        </a:prstGeom>
-                      </wps:spPr>
-                      <wps:style>
-                        <a:lnRef idx="2">
-                          <a:schemeClr val="accent1"/>
-                        </a:lnRef>
-                        <a:fillRef idx="0">
-                          <a:schemeClr val="accent1"/>
-                        </a:fillRef>
-                        <a:effectRef idx="1">
-                          <a:schemeClr val="accent1"/>
-                        </a:effectRef>
-                        <a:fontRef idx="minor">
-                          <a:schemeClr val="tx1"/>
-                        </a:fontRef>
-                      </wps:style>
-                      <wps:bodyPr/>
-                    </wps:wsp>
-                    <wps:wsp>
                       <wps:cNvPr id="47" name="Connector"/>
                       <wps:cNvCnPr>
-                        <a:stCxn id="3" idx="2"/>
-                        <a:endCxn id="4" idx="4"/>
+                        <a:stCxn id="23" idx="1"/>
+                        <a:endCxn id="25" idx="3"/>
                       </wps:cNvCnPr>
                       <wps:spPr>
                         <a:xfrm>
-                          <a:off x="571500" y="2000250"/>
-                          <a:ext cx="1905000" cy="0"/>
+                          <a:off x="1143000" y="857250"/>
+                          <a:ext cx="762000" cy="1143000"/>
                         </a:xfrm>
                         <a:prstGeom prst="line">
                           <a:avLst/>
                         </a:prstGeom>
+                        <a:ln w="12700" cap="flat" cmpd="sng" algn="ctr">
+                          <a:solidFill>
+                            <a:srgbClr val="2F5496"/>
+                          </a:solidFill>
+                          <a:prstDash val="solid"/>
+                          <a:tailEnd type="triangle" w="med" len="med"/>
+                        </a:ln>
                       </wps:spPr>
                       <wps:style>
                         <a:lnRef idx="2">
@@ -1734,17 +1948,24 @@
                     <wps:wsp>
                       <wps:cNvPr id="48" name="Connector"/>
                       <wps:cNvCnPr>
-                        <a:stCxn id="4" idx="2"/>
-                        <a:endCxn id="5" idx="4"/>
+                        <a:stCxn id="24" idx="1"/>
+                        <a:endCxn id="25" idx="3"/>
                       </wps:cNvCnPr>
                       <wps:spPr>
                         <a:xfrm>
-                          <a:off x="2476500" y="857250"/>
-                          <a:ext cx="2667000" cy="1143000"/>
+                          <a:off x="1143000" y="2000250"/>
+                          <a:ext cx="762000" cy="0"/>
                         </a:xfrm>
                         <a:prstGeom prst="line">
                           <a:avLst/>
                         </a:prstGeom>
+                        <a:ln w="12700" cap="flat" cmpd="sng" algn="ctr">
+                          <a:solidFill>
+                            <a:srgbClr val="2F5496"/>
+                          </a:solidFill>
+                          <a:prstDash val="solid"/>
+                          <a:tailEnd type="triangle" w="med" len="med"/>
+                        </a:ln>
                       </wps:spPr>
                       <wps:style>
                         <a:lnRef idx="2">
@@ -1765,17 +1986,24 @@
                     <wps:wsp>
                       <wps:cNvPr id="49" name="Connector"/>
                       <wps:cNvCnPr>
-                        <a:stCxn id="4" idx="2"/>
-                        <a:endCxn id="6" idx="4"/>
+                        <a:stCxn id="25" idx="1"/>
+                        <a:endCxn id="26" idx="3"/>
                       </wps:cNvCnPr>
                       <wps:spPr>
-                        <a:xfrm>
-                          <a:off x="2476500" y="2000250"/>
-                          <a:ext cx="2667000" cy="0"/>
+                        <a:xfrm flipV="1">
+                          <a:off x="3048000" y="857250"/>
+                          <a:ext cx="1524000" cy="1143000"/>
                         </a:xfrm>
                         <a:prstGeom prst="line">
                           <a:avLst/>
                         </a:prstGeom>
+                        <a:ln w="12700" cap="flat" cmpd="sng" algn="ctr">
+                          <a:solidFill>
+                            <a:srgbClr val="2F5496"/>
+                          </a:solidFill>
+                          <a:prstDash val="solid"/>
+                          <a:tailEnd type="triangle" w="med" len="med"/>
+                        </a:ln>
                       </wps:spPr>
                       <wps:style>
                         <a:lnRef idx="2">
@@ -1796,17 +2024,24 @@
                     <wps:wsp>
                       <wps:cNvPr id="50" name="Connector"/>
                       <wps:cNvCnPr>
-                        <a:stCxn id="5" idx="2"/>
-                        <a:endCxn id="7" idx="4"/>
+                        <a:stCxn id="25" idx="1"/>
+                        <a:endCxn id="27" idx="3"/>
                       </wps:cNvCnPr>
                       <wps:spPr>
                         <a:xfrm>
-                          <a:off x="5143500" y="857250"/>
-                          <a:ext cx="1905000" cy="1143000"/>
+                          <a:off x="3048000" y="2000250"/>
+                          <a:ext cx="1524000" cy="0"/>
                         </a:xfrm>
                         <a:prstGeom prst="line">
                           <a:avLst/>
                         </a:prstGeom>
+                        <a:ln w="12700" cap="flat" cmpd="sng" algn="ctr">
+                          <a:solidFill>
+                            <a:srgbClr val="2F5496"/>
+                          </a:solidFill>
+                          <a:prstDash val="solid"/>
+                          <a:tailEnd type="triangle" w="med" len="med"/>
+                        </a:ln>
                       </wps:spPr>
                       <wps:style>
                         <a:lnRef idx="2">
@@ -1827,17 +2062,24 @@
                     <wps:wsp>
                       <wps:cNvPr id="51" name="Connector"/>
                       <wps:cNvCnPr>
-                        <a:stCxn id="6" idx="2"/>
-                        <a:endCxn id="7" idx="4"/>
+                        <a:stCxn id="26" idx="1"/>
+                        <a:endCxn id="28" idx="3"/>
                       </wps:cNvCnPr>
                       <wps:spPr>
                         <a:xfrm>
-                          <a:off x="5143500" y="2000250"/>
-                          <a:ext cx="1905000" cy="0"/>
+                          <a:off x="5715000" y="857250"/>
+                          <a:ext cx="762000" cy="1143000"/>
                         </a:xfrm>
                         <a:prstGeom prst="line">
                           <a:avLst/>
                         </a:prstGeom>
+                        <a:ln w="12700" cap="flat" cmpd="sng" algn="ctr">
+                          <a:solidFill>
+                            <a:srgbClr val="2F5496"/>
+                          </a:solidFill>
+                          <a:prstDash val="solid"/>
+                          <a:tailEnd type="triangle" w="med" len="med"/>
+                        </a:ln>
                       </wps:spPr>
                       <wps:style>
                         <a:lnRef idx="2">
@@ -1858,17 +2100,24 @@
                     <wps:wsp>
                       <wps:cNvPr id="52" name="Connector"/>
                       <wps:cNvCnPr>
-                        <a:stCxn id="7" idx="2"/>
-                        <a:endCxn id="8" idx="4"/>
+                        <a:stCxn id="27" idx="1"/>
+                        <a:endCxn id="28" idx="3"/>
                       </wps:cNvCnPr>
                       <wps:spPr>
                         <a:xfrm>
-                          <a:off x="7048500" y="2000250"/>
-                          <a:ext cx="2667000" cy="0"/>
+                          <a:off x="5715000" y="2000250"/>
+                          <a:ext cx="762000" cy="0"/>
                         </a:xfrm>
                         <a:prstGeom prst="line">
                           <a:avLst/>
                         </a:prstGeom>
+                        <a:ln w="12700" cap="flat" cmpd="sng" algn="ctr">
+                          <a:solidFill>
+                            <a:srgbClr val="2F5496"/>
+                          </a:solidFill>
+                          <a:prstDash val="solid"/>
+                          <a:tailEnd type="triangle" w="med" len="med"/>
+                        </a:ln>
                       </wps:spPr>
                       <wps:style>
                         <a:lnRef idx="2">
@@ -1889,17 +2138,24 @@
                     <wps:wsp>
                       <wps:cNvPr id="53" name="Connector"/>
                       <wps:cNvCnPr>
-                        <a:stCxn id="8" idx="2"/>
-                        <a:endCxn id="9" idx="4"/>
+                        <a:stCxn id="28" idx="1"/>
+                        <a:endCxn id="29" idx="3"/>
                       </wps:cNvCnPr>
                       <wps:spPr>
                         <a:xfrm>
-                          <a:off x="9715500" y="2000250"/>
-                          <a:ext cx="1905000" cy="238125"/>
+                          <a:off x="7620000" y="2000250"/>
+                          <a:ext cx="1524000" cy="0"/>
                         </a:xfrm>
                         <a:prstGeom prst="line">
                           <a:avLst/>
                         </a:prstGeom>
+                        <a:ln w="12700" cap="flat" cmpd="sng" algn="ctr">
+                          <a:solidFill>
+                            <a:srgbClr val="2F5496"/>
+                          </a:solidFill>
+                          <a:prstDash val="solid"/>
+                          <a:tailEnd type="triangle" w="med" len="med"/>
+                        </a:ln>
                       </wps:spPr>
                       <wps:style>
                         <a:lnRef idx="2">
@@ -1920,17 +2176,24 @@
                     <wps:wsp>
                       <wps:cNvPr id="54" name="Connector"/>
                       <wps:cNvCnPr>
-                        <a:stCxn id="9" idx="2"/>
-                        <a:endCxn id="10" idx="4"/>
+                        <a:stCxn id="29" idx="1"/>
+                        <a:endCxn id="30" idx="3"/>
                       </wps:cNvCnPr>
                       <wps:spPr>
                         <a:xfrm>
-                          <a:off x="11620500" y="2238375"/>
-                          <a:ext cx="1905000" cy="0"/>
+                          <a:off x="10287000" y="2000250"/>
+                          <a:ext cx="762000" cy="238125"/>
                         </a:xfrm>
                         <a:prstGeom prst="line">
                           <a:avLst/>
                         </a:prstGeom>
+                        <a:ln w="12700" cap="flat" cmpd="sng" algn="ctr">
+                          <a:solidFill>
+                            <a:srgbClr val="2F5496"/>
+                          </a:solidFill>
+                          <a:prstDash val="solid"/>
+                          <a:tailEnd type="triangle" w="med" len="med"/>
+                        </a:ln>
                       </wps:spPr>
                       <wps:style>
                         <a:lnRef idx="2">
@@ -1951,17 +2214,24 @@
                     <wps:wsp>
                       <wps:cNvPr id="55" name="Connector"/>
                       <wps:cNvCnPr>
-                        <a:stCxn id="10" idx="2"/>
-                        <a:endCxn id="11" idx="4"/>
+                        <a:stCxn id="30" idx="1"/>
+                        <a:endCxn id="31" idx="3"/>
                       </wps:cNvCnPr>
                       <wps:spPr>
                         <a:xfrm>
-                          <a:off x="13525500" y="1905000"/>
-                          <a:ext cx="1905000" cy="333375"/>
+                          <a:off x="12192000" y="2238375"/>
+                          <a:ext cx="762000" cy="0"/>
                         </a:xfrm>
                         <a:prstGeom prst="line">
                           <a:avLst/>
                         </a:prstGeom>
+                        <a:ln w="12700" cap="flat" cmpd="sng" algn="ctr">
+                          <a:solidFill>
+                            <a:srgbClr val="2F5496"/>
+                          </a:solidFill>
+                          <a:prstDash val="solid"/>
+                          <a:tailEnd type="triangle" w="med" len="med"/>
+                        </a:ln>
                       </wps:spPr>
                       <wps:style>
                         <a:lnRef idx="2">
@@ -1982,17 +2252,24 @@
                     <wps:wsp>
                       <wps:cNvPr id="56" name="Connector"/>
                       <wps:cNvCnPr>
-                        <a:stCxn id="11" idx="2"/>
-                        <a:endCxn id="12" idx="4"/>
+                        <a:stCxn id="31" idx="1"/>
+                        <a:endCxn id="32" idx="3"/>
                       </wps:cNvCnPr>
                       <wps:spPr>
-                        <a:xfrm>
-                          <a:off x="15430500" y="1905000"/>
-                          <a:ext cx="1905000" cy="0"/>
+                        <a:xfrm flipV="1">
+                          <a:off x="14097000" y="1905000"/>
+                          <a:ext cx="762000" cy="333375"/>
                         </a:xfrm>
                         <a:prstGeom prst="line">
                           <a:avLst/>
                         </a:prstGeom>
+                        <a:ln w="12700" cap="flat" cmpd="sng" algn="ctr">
+                          <a:solidFill>
+                            <a:srgbClr val="2F5496"/>
+                          </a:solidFill>
+                          <a:prstDash val="solid"/>
+                          <a:tailEnd type="triangle" w="med" len="med"/>
+                        </a:ln>
                       </wps:spPr>
                       <wps:style>
                         <a:lnRef idx="2">
@@ -2013,17 +2290,24 @@
                     <wps:wsp>
                       <wps:cNvPr id="57" name="Connector"/>
                       <wps:cNvCnPr>
-                        <a:stCxn id="8" idx="2"/>
-                        <a:endCxn id="13" idx="4"/>
+                        <a:stCxn id="32" idx="1"/>
+                        <a:endCxn id="33" idx="3"/>
                       </wps:cNvCnPr>
                       <wps:spPr>
                         <a:xfrm>
-                          <a:off x="9715500" y="2000250"/>
-                          <a:ext cx="9906000" cy="238125"/>
+                          <a:off x="16002000" y="1905000"/>
+                          <a:ext cx="762000" cy="0"/>
                         </a:xfrm>
                         <a:prstGeom prst="line">
                           <a:avLst/>
                         </a:prstGeom>
+                        <a:ln w="12700" cap="flat" cmpd="sng" algn="ctr">
+                          <a:solidFill>
+                            <a:srgbClr val="2F5496"/>
+                          </a:solidFill>
+                          <a:prstDash val="solid"/>
+                          <a:tailEnd type="triangle" w="med" len="med"/>
+                        </a:ln>
                       </wps:spPr>
                       <wps:style>
                         <a:lnRef idx="2">
@@ -2044,17 +2328,24 @@
                     <wps:wsp>
                       <wps:cNvPr id="58" name="Connector"/>
                       <wps:cNvCnPr>
-                        <a:stCxn id="12" idx="2"/>
-                        <a:endCxn id="13" idx="4"/>
+                        <a:stCxn id="29" idx="1"/>
+                        <a:endCxn id="34" idx="3"/>
                       </wps:cNvCnPr>
                       <wps:spPr>
                         <a:xfrm>
-                          <a:off x="17335500" y="1905000"/>
-                          <a:ext cx="2286000" cy="333375"/>
+                          <a:off x="10287000" y="2000250"/>
+                          <a:ext cx="8763000" cy="238125"/>
                         </a:xfrm>
                         <a:prstGeom prst="line">
                           <a:avLst/>
                         </a:prstGeom>
+                        <a:ln w="12700" cap="flat" cmpd="sng" algn="ctr">
+                          <a:solidFill>
+                            <a:srgbClr val="2F5496"/>
+                          </a:solidFill>
+                          <a:prstDash val="solid"/>
+                          <a:tailEnd type="triangle" w="med" len="med"/>
+                        </a:ln>
                       </wps:spPr>
                       <wps:style>
                         <a:lnRef idx="2">
@@ -2075,17 +2366,24 @@
                     <wps:wsp>
                       <wps:cNvPr id="59" name="Connector"/>
                       <wps:cNvCnPr>
-                        <a:stCxn id="10" idx="2"/>
-                        <a:endCxn id="13" idx="4"/>
+                        <a:stCxn id="33" idx="1"/>
+                        <a:endCxn id="34" idx="3"/>
                       </wps:cNvCnPr>
                       <wps:spPr>
                         <a:xfrm>
-                          <a:off x="13525500" y="2238375"/>
-                          <a:ext cx="6096000" cy="0"/>
+                          <a:off x="17907000" y="1905000"/>
+                          <a:ext cx="1143000" cy="333375"/>
                         </a:xfrm>
                         <a:prstGeom prst="line">
                           <a:avLst/>
                         </a:prstGeom>
+                        <a:ln w="12700" cap="flat" cmpd="sng" algn="ctr">
+                          <a:solidFill>
+                            <a:srgbClr val="2F5496"/>
+                          </a:solidFill>
+                          <a:prstDash val="solid"/>
+                          <a:tailEnd type="triangle" w="med" len="med"/>
+                        </a:ln>
                       </wps:spPr>
                       <wps:style>
                         <a:lnRef idx="2">
@@ -2106,17 +2404,24 @@
                     <wps:wsp>
                       <wps:cNvPr id="60" name="Connector"/>
                       <wps:cNvCnPr>
-                        <a:stCxn id="13" idx="2"/>
-                        <a:endCxn id="14" idx="4"/>
+                        <a:stCxn id="31" idx="1"/>
+                        <a:endCxn id="34" idx="3"/>
                       </wps:cNvCnPr>
                       <wps:spPr>
                         <a:xfrm>
-                          <a:off x="19621500" y="2238375"/>
-                          <a:ext cx="2667000" cy="0"/>
+                          <a:off x="14097000" y="2238375"/>
+                          <a:ext cx="4953000" cy="0"/>
                         </a:xfrm>
                         <a:prstGeom prst="line">
                           <a:avLst/>
                         </a:prstGeom>
+                        <a:ln w="12700" cap="flat" cmpd="sng" algn="ctr">
+                          <a:solidFill>
+                            <a:srgbClr val="2F5496"/>
+                          </a:solidFill>
+                          <a:prstDash val="solid"/>
+                          <a:tailEnd type="triangle" w="med" len="med"/>
+                        </a:ln>
                       </wps:spPr>
                       <wps:style>
                         <a:lnRef idx="2">
@@ -2137,17 +2442,24 @@
                     <wps:wsp>
                       <wps:cNvPr id="61" name="Connector"/>
                       <wps:cNvCnPr>
-                        <a:stCxn id="15" idx="2"/>
-                        <a:endCxn id="16" idx="4"/>
+                        <a:stCxn id="34" idx="1"/>
+                        <a:endCxn id="35" idx="3"/>
                       </wps:cNvCnPr>
                       <wps:spPr>
                         <a:xfrm>
-                          <a:off x="22288500" y="714375"/>
-                          <a:ext cx="1905000" cy="0"/>
+                          <a:off x="20193000" y="2238375"/>
+                          <a:ext cx="1524000" cy="0"/>
                         </a:xfrm>
                         <a:prstGeom prst="line">
                           <a:avLst/>
                         </a:prstGeom>
+                        <a:ln w="12700" cap="flat" cmpd="sng" algn="ctr">
+                          <a:solidFill>
+                            <a:srgbClr val="2F5496"/>
+                          </a:solidFill>
+                          <a:prstDash val="solid"/>
+                          <a:tailEnd type="triangle" w="med" len="med"/>
+                        </a:ln>
                       </wps:spPr>
                       <wps:style>
                         <a:lnRef idx="2">
@@ -2168,17 +2480,24 @@
                     <wps:wsp>
                       <wps:cNvPr id="62" name="Connector"/>
                       <wps:cNvCnPr>
-                        <a:stCxn id="14" idx="2"/>
-                        <a:endCxn id="16" idx="4"/>
+                        <a:stCxn id="36" idx="1"/>
+                        <a:endCxn id="37" idx="3"/>
                       </wps:cNvCnPr>
                       <wps:spPr>
                         <a:xfrm>
-                          <a:off x="22288500" y="714375"/>
-                          <a:ext cx="1905000" cy="1524000"/>
+                          <a:off x="22860000" y="714375"/>
+                          <a:ext cx="762000" cy="0"/>
                         </a:xfrm>
                         <a:prstGeom prst="line">
                           <a:avLst/>
                         </a:prstGeom>
+                        <a:ln w="12700" cap="flat" cmpd="sng" algn="ctr">
+                          <a:solidFill>
+                            <a:srgbClr val="2F5496"/>
+                          </a:solidFill>
+                          <a:prstDash val="solid"/>
+                          <a:tailEnd type="triangle" w="med" len="med"/>
+                        </a:ln>
                       </wps:spPr>
                       <wps:style>
                         <a:lnRef idx="2">
@@ -2199,17 +2518,24 @@
                     <wps:wsp>
                       <wps:cNvPr id="63" name="Connector"/>
                       <wps:cNvCnPr>
-                        <a:stCxn id="16" idx="2"/>
-                        <a:endCxn id="17" idx="4"/>
+                        <a:stCxn id="35" idx="1"/>
+                        <a:endCxn id="37" idx="3"/>
                       </wps:cNvCnPr>
                       <wps:spPr>
-                        <a:xfrm>
-                          <a:off x="24193500" y="714375"/>
-                          <a:ext cx="2667000" cy="0"/>
+                        <a:xfrm flipV="1">
+                          <a:off x="22860000" y="714375"/>
+                          <a:ext cx="762000" cy="1524000"/>
                         </a:xfrm>
                         <a:prstGeom prst="line">
                           <a:avLst/>
                         </a:prstGeom>
+                        <a:ln w="12700" cap="flat" cmpd="sng" algn="ctr">
+                          <a:solidFill>
+                            <a:srgbClr val="2F5496"/>
+                          </a:solidFill>
+                          <a:prstDash val="solid"/>
+                          <a:tailEnd type="triangle" w="med" len="med"/>
+                        </a:ln>
                       </wps:spPr>
                       <wps:style>
                         <a:lnRef idx="2">
@@ -2230,17 +2556,24 @@
                     <wps:wsp>
                       <wps:cNvPr id="64" name="Connector"/>
                       <wps:cNvCnPr>
-                        <a:stCxn id="14" idx="2"/>
-                        <a:endCxn id="18" idx="4"/>
+                        <a:stCxn id="37" idx="1"/>
+                        <a:endCxn id="38" idx="3"/>
                       </wps:cNvCnPr>
                       <wps:spPr>
                         <a:xfrm>
-                          <a:off x="22288500" y="285750"/>
-                          <a:ext cx="6477000" cy="1952625"/>
+                          <a:off x="24765000" y="714375"/>
+                          <a:ext cx="1524000" cy="0"/>
                         </a:xfrm>
                         <a:prstGeom prst="line">
                           <a:avLst/>
                         </a:prstGeom>
+                        <a:ln w="12700" cap="flat" cmpd="sng" algn="ctr">
+                          <a:solidFill>
+                            <a:srgbClr val="2F5496"/>
+                          </a:solidFill>
+                          <a:prstDash val="solid"/>
+                          <a:tailEnd type="triangle" w="med" len="med"/>
+                        </a:ln>
                       </wps:spPr>
                       <wps:style>
                         <a:lnRef idx="2">
@@ -2261,17 +2594,24 @@
                     <wps:wsp>
                       <wps:cNvPr id="65" name="Connector"/>
                       <wps:cNvCnPr>
-                        <a:stCxn id="17" idx="2"/>
-                        <a:endCxn id="18" idx="4"/>
+                        <a:stCxn id="35" idx="1"/>
+                        <a:endCxn id="39" idx="3"/>
                       </wps:cNvCnPr>
                       <wps:spPr>
-                        <a:xfrm>
-                          <a:off x="26860500" y="285750"/>
-                          <a:ext cx="1905000" cy="428625"/>
+                        <a:xfrm flipV="1">
+                          <a:off x="22860000" y="285750"/>
+                          <a:ext cx="5334000" cy="1952625"/>
                         </a:xfrm>
                         <a:prstGeom prst="line">
                           <a:avLst/>
                         </a:prstGeom>
+                        <a:ln w="12700" cap="flat" cmpd="sng" algn="ctr">
+                          <a:solidFill>
+                            <a:srgbClr val="2F5496"/>
+                          </a:solidFill>
+                          <a:prstDash val="solid"/>
+                          <a:tailEnd type="triangle" w="med" len="med"/>
+                        </a:ln>
                       </wps:spPr>
                       <wps:style>
                         <a:lnRef idx="2">
@@ -2292,17 +2632,24 @@
                     <wps:wsp>
                       <wps:cNvPr id="66" name="Connector"/>
                       <wps:cNvCnPr>
-                        <a:stCxn id="18" idx="2"/>
-                        <a:endCxn id="19" idx="4"/>
+                        <a:stCxn id="38" idx="1"/>
+                        <a:endCxn id="39" idx="3"/>
                       </wps:cNvCnPr>
                       <wps:spPr>
-                        <a:xfrm>
-                          <a:off x="28765500" y="285750"/>
-                          <a:ext cx="1905000" cy="0"/>
+                        <a:xfrm flipV="1">
+                          <a:off x="27432000" y="285750"/>
+                          <a:ext cx="762000" cy="428625"/>
                         </a:xfrm>
                         <a:prstGeom prst="line">
                           <a:avLst/>
                         </a:prstGeom>
+                        <a:ln w="12700" cap="flat" cmpd="sng" algn="ctr">
+                          <a:solidFill>
+                            <a:srgbClr val="2F5496"/>
+                          </a:solidFill>
+                          <a:prstDash val="solid"/>
+                          <a:tailEnd type="triangle" w="med" len="med"/>
+                        </a:ln>
                       </wps:spPr>
                       <wps:style>
                         <a:lnRef idx="2">
@@ -2323,17 +2670,24 @@
                     <wps:wsp>
                       <wps:cNvPr id="67" name="Connector"/>
                       <wps:cNvCnPr>
-                        <a:stCxn id="20" idx="2"/>
-                        <a:endCxn id="21" idx="4"/>
+                        <a:stCxn id="39" idx="1"/>
+                        <a:endCxn id="40" idx="3"/>
                       </wps:cNvCnPr>
                       <wps:spPr>
                         <a:xfrm>
-                          <a:off x="19621500" y="3857625"/>
-                          <a:ext cx="2667000" cy="0"/>
+                          <a:off x="29337000" y="285750"/>
+                          <a:ext cx="762000" cy="0"/>
                         </a:xfrm>
                         <a:prstGeom prst="line">
                           <a:avLst/>
                         </a:prstGeom>
+                        <a:ln w="12700" cap="flat" cmpd="sng" algn="ctr">
+                          <a:solidFill>
+                            <a:srgbClr val="2F5496"/>
+                          </a:solidFill>
+                          <a:prstDash val="solid"/>
+                          <a:tailEnd type="triangle" w="med" len="med"/>
+                        </a:ln>
                       </wps:spPr>
                       <wps:style>
                         <a:lnRef idx="2">
@@ -2354,17 +2708,24 @@
                     <wps:wsp>
                       <wps:cNvPr id="68" name="Connector"/>
                       <wps:cNvCnPr>
-                        <a:stCxn id="14" idx="2"/>
-                        <a:endCxn id="22" idx="4"/>
+                        <a:stCxn id="41" idx="1"/>
+                        <a:endCxn id="42" idx="3"/>
                       </wps:cNvCnPr>
                       <wps:spPr>
                         <a:xfrm>
-                          <a:off x="22288500" y="2238375"/>
-                          <a:ext cx="1905000" cy="1190625"/>
+                          <a:off x="20193000" y="3857625"/>
+                          <a:ext cx="1524000" cy="0"/>
                         </a:xfrm>
                         <a:prstGeom prst="line">
                           <a:avLst/>
                         </a:prstGeom>
+                        <a:ln w="12700" cap="flat" cmpd="sng" algn="ctr">
+                          <a:solidFill>
+                            <a:srgbClr val="2F5496"/>
+                          </a:solidFill>
+                          <a:prstDash val="solid"/>
+                          <a:tailEnd type="triangle" w="med" len="med"/>
+                        </a:ln>
                       </wps:spPr>
                       <wps:style>
                         <a:lnRef idx="2">
@@ -2385,17 +2746,24 @@
                     <wps:wsp>
                       <wps:cNvPr id="69" name="Connector"/>
                       <wps:cNvCnPr>
-                        <a:stCxn id="21" idx="2"/>
-                        <a:endCxn id="22" idx="4"/>
+                        <a:stCxn id="35" idx="1"/>
+                        <a:endCxn id="43" idx="3"/>
                       </wps:cNvCnPr>
                       <wps:spPr>
                         <a:xfrm>
-                          <a:off x="22288500" y="3429000"/>
-                          <a:ext cx="1905000" cy="428625"/>
+                          <a:off x="22860000" y="2238375"/>
+                          <a:ext cx="762000" cy="1190625"/>
                         </a:xfrm>
                         <a:prstGeom prst="line">
                           <a:avLst/>
                         </a:prstGeom>
+                        <a:ln w="12700" cap="flat" cmpd="sng" algn="ctr">
+                          <a:solidFill>
+                            <a:srgbClr val="2F5496"/>
+                          </a:solidFill>
+                          <a:prstDash val="solid"/>
+                          <a:tailEnd type="triangle" w="med" len="med"/>
+                        </a:ln>
                       </wps:spPr>
                       <wps:style>
                         <a:lnRef idx="2">
@@ -2416,17 +2784,24 @@
                     <wps:wsp>
                       <wps:cNvPr id="70" name="Connector"/>
                       <wps:cNvCnPr>
-                        <a:stCxn id="22" idx="2"/>
-                        <a:endCxn id="23" idx="4"/>
+                        <a:stCxn id="42" idx="1"/>
+                        <a:endCxn id="43" idx="3"/>
                       </wps:cNvCnPr>
                       <wps:spPr>
-                        <a:xfrm>
-                          <a:off x="24193500" y="3429000"/>
-                          <a:ext cx="2667000" cy="0"/>
+                        <a:xfrm flipV="1">
+                          <a:off x="22860000" y="3429000"/>
+                          <a:ext cx="762000" cy="428625"/>
                         </a:xfrm>
                         <a:prstGeom prst="line">
                           <a:avLst/>
                         </a:prstGeom>
+                        <a:ln w="12700" cap="flat" cmpd="sng" algn="ctr">
+                          <a:solidFill>
+                            <a:srgbClr val="2F5496"/>
+                          </a:solidFill>
+                          <a:prstDash val="solid"/>
+                          <a:tailEnd type="triangle" w="med" len="med"/>
+                        </a:ln>
                       </wps:spPr>
                       <wps:style>
                         <a:lnRef idx="2">
@@ -2447,17 +2822,24 @@
                     <wps:wsp>
                       <wps:cNvPr id="71" name="Connector"/>
                       <wps:cNvCnPr>
-                        <a:stCxn id="23" idx="2"/>
-                        <a:endCxn id="24" idx="4"/>
+                        <a:stCxn id="43" idx="1"/>
+                        <a:endCxn id="44" idx="3"/>
                       </wps:cNvCnPr>
                       <wps:spPr>
                         <a:xfrm>
-                          <a:off x="26860500" y="3429000"/>
-                          <a:ext cx="1905000" cy="0"/>
+                          <a:off x="24765000" y="3429000"/>
+                          <a:ext cx="1524000" cy="0"/>
                         </a:xfrm>
                         <a:prstGeom prst="line">
                           <a:avLst/>
                         </a:prstGeom>
+                        <a:ln w="12700" cap="flat" cmpd="sng" algn="ctr">
+                          <a:solidFill>
+                            <a:srgbClr val="2F5496"/>
+                          </a:solidFill>
+                          <a:prstDash val="solid"/>
+                          <a:tailEnd type="triangle" w="med" len="med"/>
+                        </a:ln>
                       </wps:spPr>
                       <wps:style>
                         <a:lnRef idx="2">
@@ -2478,17 +2860,62 @@
                     <wps:wsp>
                       <wps:cNvPr id="72" name="Connector"/>
                       <wps:cNvCnPr>
-                        <a:stCxn id="24" idx="2"/>
-                        <a:endCxn id="25" idx="4"/>
+                        <a:stCxn id="44" idx="1"/>
+                        <a:endCxn id="45" idx="3"/>
                       </wps:cNvCnPr>
                       <wps:spPr>
                         <a:xfrm>
-                          <a:off x="28765500" y="3429000"/>
-                          <a:ext cx="1905000" cy="0"/>
+                          <a:off x="27432000" y="3429000"/>
+                          <a:ext cx="762000" cy="0"/>
                         </a:xfrm>
                         <a:prstGeom prst="line">
                           <a:avLst/>
                         </a:prstGeom>
+                        <a:ln w="12700" cap="flat" cmpd="sng" algn="ctr">
+                          <a:solidFill>
+                            <a:srgbClr val="2F5496"/>
+                          </a:solidFill>
+                          <a:prstDash val="solid"/>
+                          <a:tailEnd type="triangle" w="med" len="med"/>
+                        </a:ln>
+                      </wps:spPr>
+                      <wps:style>
+                        <a:lnRef idx="2">
+                          <a:schemeClr val="accent1"/>
+                        </a:lnRef>
+                        <a:fillRef idx="0">
+                          <a:schemeClr val="accent1"/>
+                        </a:fillRef>
+                        <a:effectRef idx="1">
+                          <a:schemeClr val="accent1"/>
+                        </a:effectRef>
+                        <a:fontRef idx="minor">
+                          <a:schemeClr val="tx1"/>
+                        </a:fontRef>
+                      </wps:style>
+                      <wps:bodyPr/>
+                    </wps:wsp>
+                    <wps:wsp>
+                      <wps:cNvPr id="73" name="Connector"/>
+                      <wps:cNvCnPr>
+                        <a:stCxn id="45" idx="1"/>
+                        <a:endCxn id="46" idx="3"/>
+                      </wps:cNvCnPr>
+                      <wps:spPr>
+                        <a:xfrm>
+                          <a:off x="29337000" y="3429000"/>
+                          <a:ext cx="762000" cy="0"/>
+                        </a:xfrm>
+                        <a:prstGeom prst="line">
+                          <a:avLst/>
+                        </a:prstGeom>
+                        <a:ln w="12700" cap="flat" cmpd="sng" algn="ctr">
+                          <a:solidFill>
+                            <a:srgbClr val="2F5496"/>
+                          </a:solidFill>
+                          <a:prstDash val="solid"/>
+                          <a:tailEnd type="triangle" w="med" len="med"/>
+                        </a:ln>
                       </wps:spPr>
                       <wps:style>
                         <a:lnRef idx="2">
@@ -2510,7 +2937,7 @@
                 </wpc:wpc>
               </a:graphicData>
             </a:graphic>
-          </wp:anchor>
+          </wp:inline>
         </w:drawing>
       </w:r>
     </w:p>

</xml_diff>